<commit_message>
docs: publish finalized multilingual manuals
</commit_message>
<xml_diff>
--- a/docs/manual/dist/CGA Getting Started (de).docx
+++ b/docs/manual/dist/CGA Getting Started (de).docx
@@ -25,17 +25,6 @@
           <w:i w:val="0"/>
           <w:sz w:val="21"/>
         </w:rPr>
-        <w:t>Status: Inhaltserstellung abgeschlossen, Ausführungsüberprüfung wartet</w:t>
-      </w:r>
-    </w:p>
-    <w:p>
-      <w:r>
-        <w:rPr>
-          <w:rFonts w:ascii="Arial" w:hAnsi="Arial" w:eastAsia="Arial"/>
-          <w:b w:val="0"/>
-          <w:i w:val="0"/>
-          <w:sz w:val="21"/>
-        </w:rPr>
         <w:t>Zielgruppe: Benutzer, die neu bei CGA sind</w:t>
       </w:r>
     </w:p>
@@ -48,21 +37,6 @@
           <w:sz w:val="21"/>
         </w:rPr>
         <w:t>Dieses Dokument führt Sie durch die Erstellung Ihres ersten Bots in CGA und zeigt die Ergebnisse Ihrer ersten Tests. Befolgen Sie Schritt für Schritt und überprüfen Sie die erwarteten Ergebnisse jedes Schritts, bevor Sie mit dem nächsten Schritt fortfahren.</w:t>
-      </w:r>
-    </w:p>
-    <w:p>
-      <w:pPr>
-        <w:spacing w:before="80" w:after="160"/>
-        <w:ind w:left="288" w:right="288"/>
-      </w:pPr>
-      <w:r>
-        <w:rPr>
-          <w:rFonts w:ascii="Arial" w:hAnsi="Arial" w:eastAsia="Arial"/>
-          <w:i/>
-          <w:color w:val="5F6368"/>
-          <w:sz w:val="19"/>
-        </w:rPr>
-        <w:t>Die Übermittlung der Bot-Erstellung und die Ausführung des Simulators wurden mit einem Verifizierungs-Bot bestätigt. Das ML-Lernen wurde nicht abgeschlossen, obwohl die Warteschlangenregistrierung bestätigt wurde, sodass der Erfolgspfad nach Abschluss des Lernens nicht als betriebliches Bestätigungsverfahren betrachtet wird.</w:t>
       </w:r>
     </w:p>
     <w:p>
@@ -1621,21 +1595,6 @@
     </w:p>
     <w:p>
       <w:pPr>
-        <w:spacing w:before="80" w:after="160"/>
-        <w:ind w:left="288" w:right="288"/>
-      </w:pPr>
-      <w:r>
-        <w:rPr>
-          <w:rFonts w:ascii="Arial" w:hAnsi="Arial" w:eastAsia="Arial"/>
-          <w:i/>
-          <w:color w:val="5F6368"/>
-          <w:sz w:val="19"/>
-        </w:rPr>
-        <w:t>Das Erstellungsergebnis des Verifizierungsbots und die Bildschirmverschiebung zur Version `v1` wurden bestätigt. Die Lernanfrage wurde in der Warteschlange registriert, aber der Status `Nicht trainiert` blieb nach der Aktualisierung erhalten und es gab keine Ergebnisse im Lernverlauf.</w:t>
-      </w:r>
-    </w:p>
-    <w:p>
-      <w:pPr>
         <w:pStyle w:val="Heading2"/>
       </w:pPr>
       <w:r>
@@ -1801,17 +1760,6 @@
           <w:sz w:val="21"/>
         </w:rPr>
         <w:t>Wenn ein Problem auftritt</w:t>
-      </w:r>
-    </w:p>
-    <w:p>
-      <w:r>
-        <w:rPr>
-          <w:rFonts w:ascii="Arial" w:hAnsi="Arial" w:eastAsia="Arial"/>
-          <w:b w:val="0"/>
-          <w:i w:val="0"/>
-          <w:sz w:val="21"/>
-        </w:rPr>
-        <w:t>Wenn keine Antwort erfolgt oder diese anders als erwartet ausfällt, überprüfen Sie zunächst den Bot/die Version, den Trainings- oder Indexstatus, die ausgewählte Engine und die Antwortmethode. Der Verifizierungsbot zeigte `Nicht klassifizierte Absicht` und `Die Absichtsklassifizierung kann ohne Trainingssätze nicht ausgeführt werden` an, ohne dass das Training abgeschlossen wurde.</w:t>
       </w:r>
     </w:p>
     <w:p>
@@ -2029,19 +1977,6 @@
           <w:sz w:val="21"/>
         </w:rPr>
         <w:t>[CGA NLU-Nutzungsleitfaden](../cga-nlu-guide/README.md)</w:t>
-      </w:r>
-    </w:p>
-    <w:p>
-      <w:pPr>
-        <w:pStyle w:val="ListBullet"/>
-        <w:spacing w:after="80"/>
-      </w:pPr>
-      <w:r>
-        <w:rPr>
-          <w:rFonts w:ascii="Arial" w:hAnsi="Arial" w:eastAsia="Arial"/>
-          <w:sz w:val="21"/>
-        </w:rPr>
-        <w:t>[Funktionsüberprüfungstabelle](../cga-manual-verification-matrix.md)</w:t>
       </w:r>
     </w:p>
     <w:sectPr>

</xml_diff>

<commit_message>
docs: expand multilingual manuals and getting started
</commit_message>
<xml_diff>
--- a/docs/manual/dist/CGA Getting Started (de).docx
+++ b/docs/manual/dist/CGA Getting Started (de).docx
@@ -72,6 +72,8 @@
       <w:r>
         <w:rPr>
           <w:rFonts w:ascii="Arial" w:hAnsi="Arial" w:eastAsia="Arial"/>
+          <w:b w:val="0"/>
+          <w:i w:val="0"/>
           <w:sz w:val="21"/>
         </w:rPr>
         <w:t>Sie können die erforderlichen Informationen vorbereiten, bevor Sie einen neuen Bot erstellen.</w:t>
@@ -85,6 +87,8 @@
       <w:r>
         <w:rPr>
           <w:rFonts w:ascii="Arial" w:hAnsi="Arial" w:eastAsia="Arial"/>
+          <w:b w:val="0"/>
+          <w:i w:val="0"/>
           <w:sz w:val="21"/>
         </w:rPr>
         <w:t>Sie können entscheiden, welche NLU-Methode Sie unter ML·Semantic·LLM wählen möchten.</w:t>
@@ -98,6 +102,8 @@
       <w:r>
         <w:rPr>
           <w:rFonts w:ascii="Arial" w:hAnsi="Arial" w:eastAsia="Arial"/>
+          <w:b w:val="0"/>
+          <w:i w:val="0"/>
           <w:sz w:val="21"/>
         </w:rPr>
         <w:t>Sie können das Modell, die Antwortmethode und den Supportstatus auf dem Erstellungsbildschirm überprüfen.</w:t>
@@ -111,6 +117,8 @@
       <w:r>
         <w:rPr>
           <w:rFonts w:ascii="Arial" w:hAnsi="Arial" w:eastAsia="Arial"/>
+          <w:b w:val="0"/>
+          <w:i w:val="0"/>
           <w:sz w:val="21"/>
         </w:rPr>
         <w:t>Nachdem Sie Ihren Bot erstellt haben, wissen Sie, worauf Sie beim Training oder bei der Indizierung und beim ersten Testen achten müssen.</w:t>
@@ -138,6 +146,8 @@
       <w:r>
         <w:rPr>
           <w:rFonts w:ascii="Arial" w:hAnsi="Arial" w:eastAsia="Arial"/>
+          <w:b w:val="0"/>
+          <w:i w:val="0"/>
           <w:sz w:val="21"/>
         </w:rPr>
         <w:t>CGA Studio-Konto</w:t>
@@ -151,6 +161,8 @@
       <w:r>
         <w:rPr>
           <w:rFonts w:ascii="Arial" w:hAnsi="Arial" w:eastAsia="Arial"/>
+          <w:b w:val="0"/>
+          <w:i w:val="0"/>
           <w:sz w:val="21"/>
         </w:rPr>
         <w:t>Zu erstellender Bot-Name</w:t>
@@ -164,6 +176,8 @@
       <w:r>
         <w:rPr>
           <w:rFonts w:ascii="Arial" w:hAnsi="Arial" w:eastAsia="Arial"/>
+          <w:b w:val="0"/>
+          <w:i w:val="0"/>
           <w:sz w:val="21"/>
         </w:rPr>
         <w:t>Eine kurze Benutzeräußerung zum Testen.</w:t>
@@ -177,6 +191,8 @@
       <w:r>
         <w:rPr>
           <w:rFonts w:ascii="Arial" w:hAnsi="Arial" w:eastAsia="Arial"/>
+          <w:b w:val="0"/>
+          <w:i w:val="0"/>
           <w:sz w:val="21"/>
         </w:rPr>
         <w:t>Standardauswahl für die zu verwendende NLU-Methode</w:t>
@@ -190,7 +206,61 @@
           <w:i w:val="0"/>
           <w:sz w:val="21"/>
         </w:rPr>
-        <w:t>Beim ersten Erlernen des Bildschirms wird empfohlen, den Bildschirm anhand der Kombination von `ML` und `Feste Antwort` zu überprüfen. Diese Kombination wird im aktuellen Erstellungsbildschirm als `Ausführungs-/trainingsbereit` angezeigt. Der tatsächliche Erstellungs- und Lernerfolg bedarf einer gesonderten Überprüfung.</w:t>
+        <w:t xml:space="preserve">Beim ersten Erlernen des Bildschirms wird empfohlen, den Bildschirm anhand der Kombination von </w:t>
+      </w:r>
+      <w:r>
+        <w:rPr>
+          <w:rFonts w:ascii="Arial" w:hAnsi="Arial" w:eastAsia="Arial"/>
+          <w:b/>
+          <w:i w:val="0"/>
+          <w:sz w:val="21"/>
+        </w:rPr>
+        <w:t>ML</w:t>
+      </w:r>
+      <w:r>
+        <w:rPr>
+          <w:rFonts w:ascii="Arial" w:hAnsi="Arial" w:eastAsia="Arial"/>
+          <w:b w:val="0"/>
+          <w:i w:val="0"/>
+          <w:sz w:val="21"/>
+        </w:rPr>
+        <w:t xml:space="preserve"> und </w:t>
+      </w:r>
+      <w:r>
+        <w:rPr>
+          <w:rFonts w:ascii="Arial" w:hAnsi="Arial" w:eastAsia="Arial"/>
+          <w:b/>
+          <w:i w:val="0"/>
+          <w:sz w:val="21"/>
+        </w:rPr>
+        <w:t>Feste Antwort</w:t>
+      </w:r>
+      <w:r>
+        <w:rPr>
+          <w:rFonts w:ascii="Arial" w:hAnsi="Arial" w:eastAsia="Arial"/>
+          <w:b w:val="0"/>
+          <w:i w:val="0"/>
+          <w:sz w:val="21"/>
+        </w:rPr>
+        <w:t xml:space="preserve"> zu überprüfen. Diese Kombination wird im aktuellen Erstellungsbildschirm als </w:t>
+      </w:r>
+      <w:r>
+        <w:rPr>
+          <w:rFonts w:ascii="Arial" w:hAnsi="Arial" w:eastAsia="Arial"/>
+          <w:b/>
+          <w:i w:val="0"/>
+          <w:sz w:val="21"/>
+        </w:rPr>
+        <w:t>Ausführungs-/trainingsbereit</w:t>
+      </w:r>
+      <w:r>
+        <w:rPr>
+          <w:rFonts w:ascii="Arial" w:hAnsi="Arial" w:eastAsia="Arial"/>
+          <w:b w:val="0"/>
+          <w:i w:val="0"/>
+          <w:sz w:val="21"/>
+        </w:rPr>
+        <w:t xml:space="preserve"> angezeigt. Der tatsächliche Erstellungs- und Lernerfolg bedarf einer gesonderten Überprüfung.</w:t>
       </w:r>
     </w:p>
     <w:p>
@@ -201,7 +271,25 @@
           <w:i w:val="0"/>
           <w:sz w:val="21"/>
         </w:rPr>
-        <w:t>Wenn Sie detaillierte Auswahlkriterien für die Engine benötigen, lesen Sie bitte zunächst den [NLU-Nutzungsleitfaden](../cga-nlu-guide/README.md).</w:t>
+        <w:t xml:space="preserve">Wenn Sie detaillierte Auswahlkriterien für die Engine benötigen, lesen Sie bitte zunächst den </w:t>
+      </w:r>
+      <w:r>
+        <w:rPr>
+          <w:rFonts w:ascii="Arial" w:hAnsi="Arial" w:eastAsia="Arial"/>
+          <w:b w:val="0"/>
+          <w:i w:val="0"/>
+          <w:sz w:val="21"/>
+        </w:rPr>
+        <w:t>NLU-Nutzungsleitfaden</w:t>
+      </w:r>
+      <w:r>
+        <w:rPr>
+          <w:rFonts w:ascii="Arial" w:hAnsi="Arial" w:eastAsia="Arial"/>
+          <w:b w:val="0"/>
+          <w:i w:val="0"/>
+          <w:sz w:val="21"/>
+        </w:rPr>
+        <w:t>.</w:t>
       </w:r>
     </w:p>
     <w:p>
@@ -263,6 +351,7 @@
               <w:rPr>
                 <w:rFonts w:ascii="Arial" w:hAnsi="Arial" w:eastAsia="Arial"/>
                 <w:b/>
+                <w:i w:val="0"/>
                 <w:color w:val="1F4D78"/>
                 <w:sz w:val="18"/>
               </w:rPr>
@@ -291,6 +380,7 @@
               <w:rPr>
                 <w:rFonts w:ascii="Arial" w:hAnsi="Arial" w:eastAsia="Arial"/>
                 <w:b/>
+                <w:i w:val="0"/>
                 <w:color w:val="1F4D78"/>
                 <w:sz w:val="18"/>
               </w:rPr>
@@ -320,6 +410,7 @@
               <w:rPr>
                 <w:rFonts w:ascii="Arial" w:hAnsi="Arial" w:eastAsia="Arial"/>
                 <w:b w:val="0"/>
+                <w:i w:val="0"/>
                 <w:sz w:val="18"/>
               </w:rPr>
               <w:t>Bot-Name</w:t>
@@ -346,6 +437,7 @@
               <w:rPr>
                 <w:rFonts w:ascii="Arial" w:hAnsi="Arial" w:eastAsia="Arial"/>
                 <w:b w:val="0"/>
+                <w:i w:val="0"/>
                 <w:sz w:val="18"/>
               </w:rPr>
               <w:t>Urlaubsanfrage Testbot</w:t>
@@ -374,6 +466,7 @@
               <w:rPr>
                 <w:rFonts w:ascii="Arial" w:hAnsi="Arial" w:eastAsia="Arial"/>
                 <w:b w:val="0"/>
+                <w:i w:val="0"/>
                 <w:sz w:val="18"/>
               </w:rPr>
               <w:t>Absicht</w:t>
@@ -400,6 +493,7 @@
               <w:rPr>
                 <w:rFonts w:ascii="Arial" w:hAnsi="Arial" w:eastAsia="Arial"/>
                 <w:b w:val="0"/>
+                <w:i w:val="0"/>
                 <w:sz w:val="18"/>
               </w:rPr>
               <w:t>Überprüfen Sie die verbleibenden Urlaubstage</w:t>
@@ -428,6 +522,7 @@
               <w:rPr>
                 <w:rFonts w:ascii="Arial" w:hAnsi="Arial" w:eastAsia="Arial"/>
                 <w:b w:val="0"/>
+                <w:i w:val="0"/>
                 <w:sz w:val="18"/>
               </w:rPr>
               <w:t>Beispiel für das Lernen von Sätzen</w:t>
@@ -454,6 +549,7 @@
               <w:rPr>
                 <w:rFonts w:ascii="Arial" w:hAnsi="Arial" w:eastAsia="Arial"/>
                 <w:b w:val="0"/>
+                <w:i w:val="0"/>
                 <w:sz w:val="18"/>
               </w:rPr>
               <w:t>Wie viele Tage verbleiben im Urlaub?</w:t>
@@ -482,6 +578,7 @@
               <w:rPr>
                 <w:rFonts w:ascii="Arial" w:hAnsi="Arial" w:eastAsia="Arial"/>
                 <w:b w:val="0"/>
+                <w:i w:val="0"/>
                 <w:sz w:val="18"/>
               </w:rPr>
               <w:t>Testzündung</w:t>
@@ -508,6 +605,7 @@
               <w:rPr>
                 <w:rFonts w:ascii="Arial" w:hAnsi="Arial" w:eastAsia="Arial"/>
                 <w:b w:val="0"/>
+                <w:i w:val="0"/>
                 <w:sz w:val="18"/>
               </w:rPr>
               <w:t>Wie viel Urlaub bleibt übrig?</w:t>
@@ -536,6 +634,7 @@
               <w:rPr>
                 <w:rFonts w:ascii="Arial" w:hAnsi="Arial" w:eastAsia="Arial"/>
                 <w:b w:val="0"/>
+                <w:i w:val="0"/>
                 <w:sz w:val="18"/>
               </w:rPr>
               <w:t>Erste Antwortmethode</w:t>
@@ -562,6 +661,7 @@
               <w:rPr>
                 <w:rFonts w:ascii="Arial" w:hAnsi="Arial" w:eastAsia="Arial"/>
                 <w:b w:val="0"/>
+                <w:i w:val="0"/>
                 <w:sz w:val="18"/>
               </w:rPr>
               <w:t>etablierte Antwort</w:t>
@@ -637,41 +737,47 @@
     </w:p>
     <w:p>
       <w:pPr>
-        <w:pStyle w:val="ListNumber"/>
         <w:spacing w:after="80"/>
+        <w:ind w:left="360" w:hanging="288"/>
       </w:pPr>
       <w:r>
         <w:rPr>
           <w:rFonts w:ascii="Arial" w:hAnsi="Arial" w:eastAsia="Arial"/>
+          <w:b w:val="0"/>
+          <w:i w:val="0"/>
           <w:sz w:val="21"/>
         </w:rPr>
-        <w:t>Öffnet den Anmeldebildschirm von CGA Studio.</w:t>
+        <w:t>1. Öffnet den Anmeldebildschirm von CGA Studio.</w:t>
       </w:r>
     </w:p>
     <w:p>
       <w:pPr>
-        <w:pStyle w:val="ListNumber"/>
         <w:spacing w:after="80"/>
+        <w:ind w:left="360" w:hanging="288"/>
       </w:pPr>
       <w:r>
         <w:rPr>
           <w:rFonts w:ascii="Arial" w:hAnsi="Arial" w:eastAsia="Arial"/>
+          <w:b w:val="0"/>
+          <w:i w:val="0"/>
           <w:sz w:val="21"/>
         </w:rPr>
-        <w:t>Geben Sie Ihre Kontoinformationen ein.</w:t>
+        <w:t>2. Geben Sie Ihre Kontoinformationen ein.</w:t>
       </w:r>
     </w:p>
     <w:p>
       <w:pPr>
-        <w:pStyle w:val="ListNumber"/>
         <w:spacing w:after="80"/>
+        <w:ind w:left="360" w:hanging="288"/>
       </w:pPr>
       <w:r>
         <w:rPr>
           <w:rFonts w:ascii="Arial" w:hAnsi="Arial" w:eastAsia="Arial"/>
+          <w:b w:val="0"/>
+          <w:i w:val="0"/>
           <w:sz w:val="21"/>
         </w:rPr>
-        <w:t>Wählen Sie die Schaltfläche „Anmelden“.</w:t>
+        <w:t>3. Wählen Sie die Schaltfläche „Anmelden“.</w:t>
       </w:r>
     </w:p>
     <w:p>
@@ -779,93 +885,179 @@
     </w:p>
     <w:p>
       <w:pPr>
-        <w:pStyle w:val="ListNumber"/>
         <w:spacing w:after="80"/>
+        <w:ind w:left="360" w:hanging="288"/>
       </w:pPr>
       <w:r>
         <w:rPr>
           <w:rFonts w:ascii="Arial" w:hAnsi="Arial" w:eastAsia="Arial"/>
+          <w:b w:val="0"/>
+          <w:i w:val="0"/>
           <w:sz w:val="21"/>
         </w:rPr>
-        <w:t>Gehen Sie zum Bot-Erstellungsbildschirm.</w:t>
+        <w:t>1. Gehen Sie zum Bot-Erstellungsbildschirm.</w:t>
       </w:r>
     </w:p>
     <w:p>
       <w:pPr>
-        <w:pStyle w:val="ListNumber"/>
         <w:spacing w:after="80"/>
+        <w:ind w:left="360" w:hanging="288"/>
       </w:pPr>
       <w:r>
         <w:rPr>
           <w:rFonts w:ascii="Arial" w:hAnsi="Arial" w:eastAsia="Arial"/>
+          <w:b w:val="0"/>
+          <w:i w:val="0"/>
           <w:sz w:val="21"/>
         </w:rPr>
-        <w:t>Wählen Sie `Bot` unter Bot-Typ aus.</w:t>
+        <w:t xml:space="preserve">2. Wählen Sie </w:t>
+      </w:r>
+      <w:r>
+        <w:rPr>
+          <w:rFonts w:ascii="Arial" w:hAnsi="Arial" w:eastAsia="Arial"/>
+          <w:b/>
+          <w:i w:val="0"/>
+          <w:sz w:val="21"/>
+        </w:rPr>
+        <w:t>Bot</w:t>
+      </w:r>
+      <w:r>
+        <w:rPr>
+          <w:rFonts w:ascii="Arial" w:hAnsi="Arial" w:eastAsia="Arial"/>
+          <w:b w:val="0"/>
+          <w:i w:val="0"/>
+          <w:sz w:val="21"/>
+        </w:rPr>
+        <w:t xml:space="preserve"> unter Bot-Typ aus.</w:t>
       </w:r>
     </w:p>
     <w:p>
       <w:pPr>
-        <w:pStyle w:val="ListNumber"/>
         <w:spacing w:after="80"/>
+        <w:ind w:left="360" w:hanging="288"/>
       </w:pPr>
       <w:r>
         <w:rPr>
           <w:rFonts w:ascii="Arial" w:hAnsi="Arial" w:eastAsia="Arial"/>
+          <w:b w:val="0"/>
+          <w:i w:val="0"/>
           <w:sz w:val="21"/>
         </w:rPr>
-        <w:t>Wählen Sie Texttyp oder Sprachtyp.</w:t>
+        <w:t>3. Wählen Sie Texttyp oder Sprachtyp.</w:t>
       </w:r>
     </w:p>
     <w:p>
       <w:pPr>
-        <w:pStyle w:val="ListNumber"/>
         <w:spacing w:after="80"/>
+        <w:ind w:left="360" w:hanging="288"/>
       </w:pPr>
       <w:r>
         <w:rPr>
           <w:rFonts w:ascii="Arial" w:hAnsi="Arial" w:eastAsia="Arial"/>
+          <w:b w:val="0"/>
+          <w:i w:val="0"/>
           <w:sz w:val="21"/>
         </w:rPr>
-        <w:t>Sie können jetzt im Profilbereich ein PC-Bild auswählen.</w:t>
+        <w:t>4. Sie können jetzt im Profilbereich ein PC-Bild auswählen.</w:t>
       </w:r>
     </w:p>
     <w:p>
       <w:pPr>
-        <w:pStyle w:val="ListNumber"/>
         <w:spacing w:after="80"/>
+        <w:ind w:left="360" w:hanging="288"/>
       </w:pPr>
       <w:r>
         <w:rPr>
           <w:rFonts w:ascii="Arial" w:hAnsi="Arial" w:eastAsia="Arial"/>
+          <w:b w:val="0"/>
+          <w:i w:val="0"/>
           <w:sz w:val="21"/>
         </w:rPr>
-        <w:t>Geben Sie den Bot-Namen in das Feld `Geben Sie den Bot-Namen ein.` ein.</w:t>
+        <w:t xml:space="preserve">5. Geben Sie den Bot-Namen in das Feld </w:t>
+      </w:r>
+      <w:r>
+        <w:rPr>
+          <w:rFonts w:ascii="Arial" w:hAnsi="Arial" w:eastAsia="Arial"/>
+          <w:b/>
+          <w:i w:val="0"/>
+          <w:sz w:val="21"/>
+        </w:rPr>
+        <w:t>Geben Sie den Bot-Namen ein.</w:t>
+      </w:r>
+      <w:r>
+        <w:rPr>
+          <w:rFonts w:ascii="Arial" w:hAnsi="Arial" w:eastAsia="Arial"/>
+          <w:b w:val="0"/>
+          <w:i w:val="0"/>
+          <w:sz w:val="21"/>
+        </w:rPr>
+        <w:t xml:space="preserve"> ein.</w:t>
       </w:r>
     </w:p>
     <w:p>
       <w:pPr>
-        <w:pStyle w:val="ListNumber"/>
         <w:spacing w:after="80"/>
+        <w:ind w:left="360" w:hanging="288"/>
       </w:pPr>
       <w:r>
         <w:rPr>
           <w:rFonts w:ascii="Arial" w:hAnsi="Arial" w:eastAsia="Arial"/>
+          <w:b w:val="0"/>
+          <w:i w:val="0"/>
           <w:sz w:val="21"/>
         </w:rPr>
-        <w:t>Überprüfen Sie `Koreanisch` in der Sprache.</w:t>
+        <w:t xml:space="preserve">6. Überprüfen Sie </w:t>
+      </w:r>
+      <w:r>
+        <w:rPr>
+          <w:rFonts w:ascii="Arial" w:hAnsi="Arial" w:eastAsia="Arial"/>
+          <w:b/>
+          <w:i w:val="0"/>
+          <w:sz w:val="21"/>
+        </w:rPr>
+        <w:t>Koreanisch</w:t>
+      </w:r>
+      <w:r>
+        <w:rPr>
+          <w:rFonts w:ascii="Arial" w:hAnsi="Arial" w:eastAsia="Arial"/>
+          <w:b w:val="0"/>
+          <w:i w:val="0"/>
+          <w:sz w:val="21"/>
+        </w:rPr>
+        <w:t xml:space="preserve"> in der Sprache.</w:t>
       </w:r>
     </w:p>
     <w:p>
       <w:pPr>
-        <w:pStyle w:val="ListNumber"/>
         <w:spacing w:after="80"/>
+        <w:ind w:left="360" w:hanging="288"/>
       </w:pPr>
       <w:r>
         <w:rPr>
           <w:rFonts w:ascii="Arial" w:hAnsi="Arial" w:eastAsia="Arial"/>
+          <w:b w:val="0"/>
+          <w:i w:val="0"/>
           <w:sz w:val="21"/>
         </w:rPr>
-        <w:t>Geben Sie bei Bedarf eine Einführung in das Feld `Geben Sie eine Beschreibung des Bots ein.` ein.</w:t>
+        <w:t xml:space="preserve">7. Geben Sie bei Bedarf eine Einführung in das Feld </w:t>
+      </w:r>
+      <w:r>
+        <w:rPr>
+          <w:rFonts w:ascii="Arial" w:hAnsi="Arial" w:eastAsia="Arial"/>
+          <w:b/>
+          <w:i w:val="0"/>
+          <w:sz w:val="21"/>
+        </w:rPr>
+        <w:t>Geben Sie eine Beschreibung des Bots ein.</w:t>
+      </w:r>
+      <w:r>
+        <w:rPr>
+          <w:rFonts w:ascii="Arial" w:hAnsi="Arial" w:eastAsia="Arial"/>
+          <w:b w:val="0"/>
+          <w:i w:val="0"/>
+          <w:sz w:val="21"/>
+        </w:rPr>
+        <w:t xml:space="preserve"> ein.</w:t>
       </w:r>
     </w:p>
     <w:p>
@@ -937,6 +1129,8 @@
       <w:r>
         <w:rPr>
           <w:rFonts w:ascii="Arial" w:hAnsi="Arial" w:eastAsia="Arial"/>
+          <w:b w:val="0"/>
+          <w:i w:val="0"/>
           <w:sz w:val="21"/>
         </w:rPr>
         <w:t>Wie kann ich verhindern, dass mein Bot-Name mit anderen Bots verwechselt wird?</w:t>
@@ -950,6 +1144,8 @@
       <w:r>
         <w:rPr>
           <w:rFonts w:ascii="Arial" w:hAnsi="Arial" w:eastAsia="Arial"/>
+          <w:b w:val="0"/>
+          <w:i w:val="0"/>
           <w:sz w:val="21"/>
         </w:rPr>
         <w:t>Haben Sie die Testäußerung als einen Satz vorbereitet?</w:t>
@@ -963,6 +1159,8 @@
       <w:r>
         <w:rPr>
           <w:rFonts w:ascii="Arial" w:hAnsi="Arial" w:eastAsia="Arial"/>
+          <w:b w:val="0"/>
+          <w:i w:val="0"/>
           <w:sz w:val="21"/>
         </w:rPr>
         <w:t>Haben Sie bei der Eingabe des Tests tatsächliche Betriebsdaten oder persönliche Informationen verwendet?</w:t>
@@ -1029,7 +1227,25 @@
           <w:i w:val="0"/>
           <w:sz w:val="21"/>
         </w:rPr>
-        <w:t>Wählen Sie in `NLU-Methode` eine der folgenden Optionen aus:</w:t>
+        <w:t xml:space="preserve">Wählen Sie in </w:t>
+      </w:r>
+      <w:r>
+        <w:rPr>
+          <w:rFonts w:ascii="Arial" w:hAnsi="Arial" w:eastAsia="Arial"/>
+          <w:b/>
+          <w:i w:val="0"/>
+          <w:sz w:val="21"/>
+        </w:rPr>
+        <w:t>NLU-Methode</w:t>
+      </w:r>
+      <w:r>
+        <w:rPr>
+          <w:rFonts w:ascii="Arial" w:hAnsi="Arial" w:eastAsia="Arial"/>
+          <w:b w:val="0"/>
+          <w:i w:val="0"/>
+          <w:sz w:val="21"/>
+        </w:rPr>
+        <w:t xml:space="preserve"> eine der folgenden Optionen aus:</w:t>
       </w:r>
     </w:p>
     <w:p>
@@ -1040,9 +1256,11 @@
       <w:r>
         <w:rPr>
           <w:rFonts w:ascii="Arial" w:hAnsi="Arial" w:eastAsia="Arial"/>
+          <w:b/>
+          <w:i w:val="0"/>
           <w:sz w:val="21"/>
         </w:rPr>
-        <w:t>`ML`</w:t>
+        <w:t>ML</w:t>
       </w:r>
     </w:p>
     <w:p>
@@ -1053,9 +1271,11 @@
       <w:r>
         <w:rPr>
           <w:rFonts w:ascii="Arial" w:hAnsi="Arial" w:eastAsia="Arial"/>
+          <w:b/>
+          <w:i w:val="0"/>
           <w:sz w:val="21"/>
         </w:rPr>
-        <w:t>`Semantic - Vector Worker`</w:t>
+        <w:t>Semantic - Vector Worker</w:t>
       </w:r>
     </w:p>
     <w:p>
@@ -1066,9 +1286,11 @@
       <w:r>
         <w:rPr>
           <w:rFonts w:ascii="Arial" w:hAnsi="Arial" w:eastAsia="Arial"/>
+          <w:b/>
+          <w:i w:val="0"/>
           <w:sz w:val="21"/>
         </w:rPr>
-        <w:t>`Semantic - External Embedding`</w:t>
+        <w:t>Semantic - External Embedding</w:t>
       </w:r>
     </w:p>
     <w:p>
@@ -1079,9 +1301,11 @@
       <w:r>
         <w:rPr>
           <w:rFonts w:ascii="Arial" w:hAnsi="Arial" w:eastAsia="Arial"/>
+          <w:b/>
+          <w:i w:val="0"/>
           <w:sz w:val="21"/>
         </w:rPr>
-        <w:t>`LLM Engine`</w:t>
+        <w:t>LLM Engine</w:t>
       </w:r>
     </w:p>
     <w:p>
@@ -1106,7 +1330,43 @@
           <w:i w:val="0"/>
           <w:sz w:val="21"/>
         </w:rPr>
-        <w:t>Das NLU-Modell und zusätzliche Einstellungselemente, die für die ausgewählte Methode geeignet sind, werden angezeigt. Wenn Sie beispielsweise `Semantic - External Embedding` auswählen, werden das Einbettungsmodell und die Intent Vector DB-Verbindungselemente angezeigt. Wenn Sie `LLM Engine` auswählen, werden der Anbieter und detaillierte Modellelemente angezeigt.</w:t>
+        <w:t xml:space="preserve">Das NLU-Modell und zusätzliche Einstellungselemente, die für die ausgewählte Methode geeignet sind, werden angezeigt. Wenn Sie beispielsweise </w:t>
+      </w:r>
+      <w:r>
+        <w:rPr>
+          <w:rFonts w:ascii="Arial" w:hAnsi="Arial" w:eastAsia="Arial"/>
+          <w:b/>
+          <w:i w:val="0"/>
+          <w:sz w:val="21"/>
+        </w:rPr>
+        <w:t>Semantic - External Embedding</w:t>
+      </w:r>
+      <w:r>
+        <w:rPr>
+          <w:rFonts w:ascii="Arial" w:hAnsi="Arial" w:eastAsia="Arial"/>
+          <w:b w:val="0"/>
+          <w:i w:val="0"/>
+          <w:sz w:val="21"/>
+        </w:rPr>
+        <w:t xml:space="preserve"> auswählen, werden das Einbettungsmodell und die Intent Vector DB-Verbindungselemente angezeigt. Wenn Sie </w:t>
+      </w:r>
+      <w:r>
+        <w:rPr>
+          <w:rFonts w:ascii="Arial" w:hAnsi="Arial" w:eastAsia="Arial"/>
+          <w:b/>
+          <w:i w:val="0"/>
+          <w:sz w:val="21"/>
+        </w:rPr>
+        <w:t>LLM Engine</w:t>
+      </w:r>
+      <w:r>
+        <w:rPr>
+          <w:rFonts w:ascii="Arial" w:hAnsi="Arial" w:eastAsia="Arial"/>
+          <w:b w:val="0"/>
+          <w:i w:val="0"/>
+          <w:sz w:val="21"/>
+        </w:rPr>
+        <w:t xml:space="preserve"> auswählen, werden der Anbieter und detaillierte Modellelemente angezeigt.</w:t>
       </w:r>
     </w:p>
     <w:p>
@@ -1131,6 +1391,8 @@
       <w:r>
         <w:rPr>
           <w:rFonts w:ascii="Arial" w:hAnsi="Arial" w:eastAsia="Arial"/>
+          <w:b w:val="0"/>
+          <w:i w:val="0"/>
           <w:sz w:val="21"/>
         </w:rPr>
         <w:t>Sehen Sie sich ML als Ausgangspunkt für die direkte Gestaltung von Lernsätzen und -absichten an.</w:t>
@@ -1144,6 +1406,8 @@
       <w:r>
         <w:rPr>
           <w:rFonts w:ascii="Arial" w:hAnsi="Arial" w:eastAsia="Arial"/>
+          <w:b w:val="0"/>
+          <w:i w:val="0"/>
           <w:sz w:val="21"/>
         </w:rPr>
         <w:t>Wenn die Struktur semantische Ähnlichkeit und Vektor-DB verwendet, ziehen Sie Semantik in Betracht.</w:t>
@@ -1157,6 +1421,8 @@
       <w:r>
         <w:rPr>
           <w:rFonts w:ascii="Arial" w:hAnsi="Arial" w:eastAsia="Arial"/>
+          <w:b w:val="0"/>
+          <w:i w:val="0"/>
           <w:sz w:val="21"/>
         </w:rPr>
         <w:t>Überprüfen Sie das LLM, wenn Sie bereit sind, das Modell mit einem LLM-Anbieter zu betreiben.</w:t>
@@ -1170,7 +1436,25 @@
           <w:i w:val="0"/>
           <w:sz w:val="21"/>
         </w:rPr>
-        <w:t>Eine spezifische Auswahl finden Sie in der [Motorvergleichstabelle](../cga-nlu-guide/engine-comparison.md).</w:t>
+        <w:t xml:space="preserve">Eine spezifische Auswahl finden Sie in der </w:t>
+      </w:r>
+      <w:r>
+        <w:rPr>
+          <w:rFonts w:ascii="Arial" w:hAnsi="Arial" w:eastAsia="Arial"/>
+          <w:b w:val="0"/>
+          <w:i w:val="0"/>
+          <w:sz w:val="21"/>
+        </w:rPr>
+        <w:t>Motorvergleichstabelle</w:t>
+      </w:r>
+      <w:r>
+        <w:rPr>
+          <w:rFonts w:ascii="Arial" w:hAnsi="Arial" w:eastAsia="Arial"/>
+          <w:b w:val="0"/>
+          <w:i w:val="0"/>
+          <w:sz w:val="21"/>
+        </w:rPr>
+        <w:t>.</w:t>
       </w:r>
     </w:p>
     <w:p>
@@ -1228,54 +1512,170 @@
     </w:p>
     <w:p>
       <w:pPr>
-        <w:pStyle w:val="ListNumber"/>
         <w:spacing w:after="80"/>
+        <w:ind w:left="360" w:hanging="288"/>
       </w:pPr>
       <w:r>
         <w:rPr>
           <w:rFonts w:ascii="Arial" w:hAnsi="Arial" w:eastAsia="Arial"/>
+          <w:b w:val="0"/>
+          <w:i w:val="0"/>
           <w:sz w:val="21"/>
         </w:rPr>
-        <w:t>Überprüfen Sie die verfügbaren Modelle in `NLU-Modell`.</w:t>
+        <w:t xml:space="preserve">1. Überprüfen Sie die verfügbaren Modelle in </w:t>
+      </w:r>
+      <w:r>
+        <w:rPr>
+          <w:rFonts w:ascii="Arial" w:hAnsi="Arial" w:eastAsia="Arial"/>
+          <w:b/>
+          <w:i w:val="0"/>
+          <w:sz w:val="21"/>
+        </w:rPr>
+        <w:t>NLU-Modell</w:t>
+      </w:r>
+      <w:r>
+        <w:rPr>
+          <w:rFonts w:ascii="Arial" w:hAnsi="Arial" w:eastAsia="Arial"/>
+          <w:b w:val="0"/>
+          <w:i w:val="0"/>
+          <w:sz w:val="21"/>
+        </w:rPr>
+        <w:t>.</w:t>
       </w:r>
     </w:p>
     <w:p>
       <w:pPr>
-        <w:pStyle w:val="ListNumber"/>
         <w:spacing w:after="80"/>
+        <w:ind w:left="360" w:hanging="288"/>
       </w:pPr>
       <w:r>
         <w:rPr>
           <w:rFonts w:ascii="Arial" w:hAnsi="Arial" w:eastAsia="Arial"/>
+          <w:b w:val="0"/>
+          <w:i w:val="0"/>
           <w:sz w:val="21"/>
         </w:rPr>
-        <w:t>Überprüfen Sie in `Antwortmethode`, welche Elemente aus der festgelegten Antwort, der Semantic Engine RAG-Antwort, der LLM Engine RAG-Antwort und der LLM Engine-Antwort ausgewählt werden können.</w:t>
+        <w:t xml:space="preserve">2. Überprüfen Sie in </w:t>
+      </w:r>
+      <w:r>
+        <w:rPr>
+          <w:rFonts w:ascii="Arial" w:hAnsi="Arial" w:eastAsia="Arial"/>
+          <w:b/>
+          <w:i w:val="0"/>
+          <w:sz w:val="21"/>
+        </w:rPr>
+        <w:t>Antwortmethode</w:t>
+      </w:r>
+      <w:r>
+        <w:rPr>
+          <w:rFonts w:ascii="Arial" w:hAnsi="Arial" w:eastAsia="Arial"/>
+          <w:b w:val="0"/>
+          <w:i w:val="0"/>
+          <w:sz w:val="21"/>
+        </w:rPr>
+        <w:t>, welche Elemente aus der festgelegten Antwort, der Semantic Engine RAG-Antwort, der LLM Engine RAG-Antwort und der LLM Engine-Antwort ausgewählt werden können.</w:t>
       </w:r>
     </w:p>
     <w:p>
       <w:pPr>
-        <w:pStyle w:val="ListNumber"/>
         <w:spacing w:after="80"/>
+        <w:ind w:left="360" w:hanging="288"/>
       </w:pPr>
       <w:r>
         <w:rPr>
           <w:rFonts w:ascii="Arial" w:hAnsi="Arial" w:eastAsia="Arial"/>
+          <w:b w:val="0"/>
+          <w:i w:val="0"/>
           <w:sz w:val="21"/>
         </w:rPr>
-        <w:t>Überprüfen Sie den Unterstützungsstatus der Auswahlkombination.</w:t>
+        <w:t>3. Überprüfen Sie den Unterstützungsstatus der Auswahlkombination.</w:t>
       </w:r>
     </w:p>
     <w:p>
       <w:pPr>
-        <w:pStyle w:val="ListNumber"/>
         <w:spacing w:after="80"/>
+        <w:ind w:left="360" w:hanging="288"/>
       </w:pPr>
       <w:r>
         <w:rPr>
           <w:rFonts w:ascii="Arial" w:hAnsi="Arial" w:eastAsia="Arial"/>
+          <w:b w:val="0"/>
+          <w:i w:val="0"/>
           <w:sz w:val="21"/>
         </w:rPr>
-        <w:t>Stellen Sie bei der ersten Überprüfung der Einstellungen sicher, dass die Kombination `ML` + `DeepLearning Lite` + `Feste Antwort` als `Ausführungs-/trainingsbereit` angezeigt wird.</w:t>
+        <w:t xml:space="preserve">4. Stellen Sie bei der ersten Überprüfung der Einstellungen sicher, dass die Kombination </w:t>
+      </w:r>
+      <w:r>
+        <w:rPr>
+          <w:rFonts w:ascii="Arial" w:hAnsi="Arial" w:eastAsia="Arial"/>
+          <w:b/>
+          <w:i w:val="0"/>
+          <w:sz w:val="21"/>
+        </w:rPr>
+        <w:t>ML</w:t>
+      </w:r>
+      <w:r>
+        <w:rPr>
+          <w:rFonts w:ascii="Arial" w:hAnsi="Arial" w:eastAsia="Arial"/>
+          <w:b w:val="0"/>
+          <w:i w:val="0"/>
+          <w:sz w:val="21"/>
+        </w:rPr>
+        <w:t xml:space="preserve"> + </w:t>
+      </w:r>
+      <w:r>
+        <w:rPr>
+          <w:rFonts w:ascii="Arial" w:hAnsi="Arial" w:eastAsia="Arial"/>
+          <w:b/>
+          <w:i w:val="0"/>
+          <w:sz w:val="21"/>
+        </w:rPr>
+        <w:t>DeepLearning Lite</w:t>
+      </w:r>
+      <w:r>
+        <w:rPr>
+          <w:rFonts w:ascii="Arial" w:hAnsi="Arial" w:eastAsia="Arial"/>
+          <w:b w:val="0"/>
+          <w:i w:val="0"/>
+          <w:sz w:val="21"/>
+        </w:rPr>
+        <w:t xml:space="preserve"> + </w:t>
+      </w:r>
+      <w:r>
+        <w:rPr>
+          <w:rFonts w:ascii="Arial" w:hAnsi="Arial" w:eastAsia="Arial"/>
+          <w:b/>
+          <w:i w:val="0"/>
+          <w:sz w:val="21"/>
+        </w:rPr>
+        <w:t>Feste Antwort</w:t>
+      </w:r>
+      <w:r>
+        <w:rPr>
+          <w:rFonts w:ascii="Arial" w:hAnsi="Arial" w:eastAsia="Arial"/>
+          <w:b w:val="0"/>
+          <w:i w:val="0"/>
+          <w:sz w:val="21"/>
+        </w:rPr>
+        <w:t xml:space="preserve"> als </w:t>
+      </w:r>
+      <w:r>
+        <w:rPr>
+          <w:rFonts w:ascii="Arial" w:hAnsi="Arial" w:eastAsia="Arial"/>
+          <w:b/>
+          <w:i w:val="0"/>
+          <w:sz w:val="21"/>
+        </w:rPr>
+        <w:t>Ausführungs-/trainingsbereit</w:t>
+      </w:r>
+      <w:r>
+        <w:rPr>
+          <w:rFonts w:ascii="Arial" w:hAnsi="Arial" w:eastAsia="Arial"/>
+          <w:b w:val="0"/>
+          <w:i w:val="0"/>
+          <w:sz w:val="21"/>
+        </w:rPr>
+        <w:t xml:space="preserve"> angezeigt wird.</w:t>
       </w:r>
     </w:p>
     <w:p>
@@ -1447,7 +1847,25 @@
           <w:i w:val="0"/>
           <w:sz w:val="21"/>
         </w:rPr>
-        <w:t>Detaillierte Datenerstellung und Qualitätsverbesserung für jede Engine werden im entsprechenden Kapitel des [NLU Utilization Guide](../cga-nlu-guide/README.md) behandelt.</w:t>
+        <w:t xml:space="preserve">Detaillierte Datenerstellung und Qualitätsverbesserung für jede Engine werden im entsprechenden Kapitel des </w:t>
+      </w:r>
+      <w:r>
+        <w:rPr>
+          <w:rFonts w:ascii="Arial" w:hAnsi="Arial" w:eastAsia="Arial"/>
+          <w:b w:val="0"/>
+          <w:i w:val="0"/>
+          <w:sz w:val="21"/>
+        </w:rPr>
+        <w:t>NLU Utilization Guide</w:t>
+      </w:r>
+      <w:r>
+        <w:rPr>
+          <w:rFonts w:ascii="Arial" w:hAnsi="Arial" w:eastAsia="Arial"/>
+          <w:b w:val="0"/>
+          <w:i w:val="0"/>
+          <w:sz w:val="21"/>
+        </w:rPr>
+        <w:t xml:space="preserve"> behandelt.</w:t>
       </w:r>
     </w:p>
     <w:p>
@@ -1505,67 +1923,95 @@
     </w:p>
     <w:p>
       <w:pPr>
-        <w:pStyle w:val="ListNumber"/>
         <w:spacing w:after="80"/>
+        <w:ind w:left="360" w:hanging="288"/>
       </w:pPr>
       <w:r>
         <w:rPr>
           <w:rFonts w:ascii="Arial" w:hAnsi="Arial" w:eastAsia="Arial"/>
+          <w:b w:val="0"/>
+          <w:i w:val="0"/>
           <w:sz w:val="21"/>
         </w:rPr>
-        <w:t>Überprüfen Sie die Eingabewerte und die Motorkombination erneut.</w:t>
+        <w:t>1. Überprüfen Sie die Eingabewerte und die Motorkombination erneut.</w:t>
       </w:r>
     </w:p>
     <w:p>
       <w:pPr>
-        <w:pStyle w:val="ListNumber"/>
         <w:spacing w:after="80"/>
+        <w:ind w:left="360" w:hanging="288"/>
       </w:pPr>
       <w:r>
         <w:rPr>
           <w:rFonts w:ascii="Arial" w:hAnsi="Arial" w:eastAsia="Arial"/>
+          <w:b w:val="0"/>
+          <w:i w:val="0"/>
           <w:sz w:val="21"/>
         </w:rPr>
-        <w:t>Wählen Sie auf dem Erstellungsbildschirm die Schaltfläche `Bestätigen`.</w:t>
+        <w:t xml:space="preserve">2. Wählen Sie auf dem Erstellungsbildschirm die Schaltfläche </w:t>
+      </w:r>
+      <w:r>
+        <w:rPr>
+          <w:rFonts w:ascii="Arial" w:hAnsi="Arial" w:eastAsia="Arial"/>
+          <w:b/>
+          <w:i w:val="0"/>
+          <w:sz w:val="21"/>
+        </w:rPr>
+        <w:t>Bestätigen</w:t>
+      </w:r>
+      <w:r>
+        <w:rPr>
+          <w:rFonts w:ascii="Arial" w:hAnsi="Arial" w:eastAsia="Arial"/>
+          <w:b w:val="0"/>
+          <w:i w:val="0"/>
+          <w:sz w:val="21"/>
+        </w:rPr>
+        <w:t>.</w:t>
       </w:r>
     </w:p>
     <w:p>
       <w:pPr>
-        <w:pStyle w:val="ListNumber"/>
         <w:spacing w:after="80"/>
+        <w:ind w:left="360" w:hanging="288"/>
       </w:pPr>
       <w:r>
         <w:rPr>
           <w:rFonts w:ascii="Arial" w:hAnsi="Arial" w:eastAsia="Arial"/>
+          <w:b w:val="0"/>
+          <w:i w:val="0"/>
           <w:sz w:val="21"/>
         </w:rPr>
-        <w:t>Überprüfen Sie das Erstellungsergebnis und den Versionsstatus.</w:t>
+        <w:t>3. Überprüfen Sie das Erstellungsergebnis und den Versionsstatus.</w:t>
       </w:r>
     </w:p>
     <w:p>
       <w:pPr>
-        <w:pStyle w:val="ListNumber"/>
         <w:spacing w:after="80"/>
+        <w:ind w:left="360" w:hanging="288"/>
       </w:pPr>
       <w:r>
         <w:rPr>
           <w:rFonts w:ascii="Arial" w:hAnsi="Arial" w:eastAsia="Arial"/>
+          <w:b w:val="0"/>
+          <w:i w:val="0"/>
           <w:sz w:val="21"/>
         </w:rPr>
-        <w:t>Führen Sie alle für die ausgewählte Engine erforderlichen Schulungs- oder Indexvorbereitungsjobs aus.</w:t>
+        <w:t>4. Führen Sie alle für die ausgewählte Engine erforderlichen Schulungs- oder Indexvorbereitungsjobs aus.</w:t>
       </w:r>
     </w:p>
     <w:p>
       <w:pPr>
-        <w:pStyle w:val="ListNumber"/>
         <w:spacing w:after="80"/>
+        <w:ind w:left="360" w:hanging="288"/>
       </w:pPr>
       <w:r>
         <w:rPr>
           <w:rFonts w:ascii="Arial" w:hAnsi="Arial" w:eastAsia="Arial"/>
+          <w:b w:val="0"/>
+          <w:i w:val="0"/>
           <w:sz w:val="21"/>
         </w:rPr>
-        <w:t>Stellen Sie sicher, dass sich der Status in „Abgeschlossen“ oder „Verfügbar“ geändert hat.</w:t>
+        <w:t>5. Stellen Sie sicher, dass sich der Status in „Abgeschlossen“ oder „Verfügbar“ geändert hat.</w:t>
       </w:r>
     </w:p>
     <w:p>
@@ -1615,7 +2061,61 @@
           <w:i w:val="0"/>
           <w:sz w:val="21"/>
         </w:rPr>
-        <w:t>Wenn sich die Lernschaltfläche zu `Training läuft` ändert und nach der Aktualisierung erneut `Trainieren` und `Nicht trainiert` angezeigt wird, ist das Lernen nicht erfolgreich. Wir überprüfen die Abschlusszeit und den Status in der Abfrage des Trainingsverlaufs. Wenn keine Ergebnisse vorliegen, verwenden wir den Simulatortest nicht zur Qualitätsprüfung.</w:t>
+        <w:t xml:space="preserve">Wenn sich die Lernschaltfläche zu </w:t>
+      </w:r>
+      <w:r>
+        <w:rPr>
+          <w:rFonts w:ascii="Arial" w:hAnsi="Arial" w:eastAsia="Arial"/>
+          <w:b/>
+          <w:i w:val="0"/>
+          <w:sz w:val="21"/>
+        </w:rPr>
+        <w:t>Training läuft</w:t>
+      </w:r>
+      <w:r>
+        <w:rPr>
+          <w:rFonts w:ascii="Arial" w:hAnsi="Arial" w:eastAsia="Arial"/>
+          <w:b w:val="0"/>
+          <w:i w:val="0"/>
+          <w:sz w:val="21"/>
+        </w:rPr>
+        <w:t xml:space="preserve"> ändert und nach der Aktualisierung erneut </w:t>
+      </w:r>
+      <w:r>
+        <w:rPr>
+          <w:rFonts w:ascii="Arial" w:hAnsi="Arial" w:eastAsia="Arial"/>
+          <w:b/>
+          <w:i w:val="0"/>
+          <w:sz w:val="21"/>
+        </w:rPr>
+        <w:t>Trainieren</w:t>
+      </w:r>
+      <w:r>
+        <w:rPr>
+          <w:rFonts w:ascii="Arial" w:hAnsi="Arial" w:eastAsia="Arial"/>
+          <w:b w:val="0"/>
+          <w:i w:val="0"/>
+          <w:sz w:val="21"/>
+        </w:rPr>
+        <w:t xml:space="preserve"> und </w:t>
+      </w:r>
+      <w:r>
+        <w:rPr>
+          <w:rFonts w:ascii="Arial" w:hAnsi="Arial" w:eastAsia="Arial"/>
+          <w:b/>
+          <w:i w:val="0"/>
+          <w:sz w:val="21"/>
+        </w:rPr>
+        <w:t>Nicht trainiert</w:t>
+      </w:r>
+      <w:r>
+        <w:rPr>
+          <w:rFonts w:ascii="Arial" w:hAnsi="Arial" w:eastAsia="Arial"/>
+          <w:b w:val="0"/>
+          <w:i w:val="0"/>
+          <w:sz w:val="21"/>
+        </w:rPr>
+        <w:t xml:space="preserve"> angezeigt wird, ist das Lernen nicht erfolgreich. Wir überprüfen die Abschlusszeit und den Status in der Abfrage des Trainingsverlaufs. Wenn keine Ergebnisse vorliegen, verwenden wir den Simulatortest nicht zur Qualitätsprüfung.</w:t>
       </w:r>
     </w:p>
     <w:p>
@@ -1673,54 +2173,62 @@
     </w:p>
     <w:p>
       <w:pPr>
-        <w:pStyle w:val="ListNumber"/>
         <w:spacing w:after="80"/>
+        <w:ind w:left="360" w:hanging="288"/>
       </w:pPr>
       <w:r>
         <w:rPr>
           <w:rFonts w:ascii="Arial" w:hAnsi="Arial" w:eastAsia="Arial"/>
+          <w:b w:val="0"/>
+          <w:i w:val="0"/>
           <w:sz w:val="21"/>
         </w:rPr>
-        <w:t>Gehen Sie zum Versionsarbeitsbildschirm für den von Ihnen erstellten Bot.</w:t>
+        <w:t>1. Gehen Sie zum Versionsarbeitsbildschirm für den von Ihnen erstellten Bot.</w:t>
       </w:r>
     </w:p>
     <w:p>
       <w:pPr>
-        <w:pStyle w:val="ListNumber"/>
         <w:spacing w:after="80"/>
+        <w:ind w:left="360" w:hanging="288"/>
       </w:pPr>
       <w:r>
         <w:rPr>
           <w:rFonts w:ascii="Arial" w:hAnsi="Arial" w:eastAsia="Arial"/>
+          <w:b w:val="0"/>
+          <w:i w:val="0"/>
           <w:sz w:val="21"/>
         </w:rPr>
-        <w:t>Öffnen Sie den Simulator.</w:t>
+        <w:t>2. Öffnen Sie den Simulator.</w:t>
       </w:r>
     </w:p>
     <w:p>
       <w:pPr>
-        <w:pStyle w:val="ListNumber"/>
         <w:spacing w:after="80"/>
+        <w:ind w:left="360" w:hanging="288"/>
       </w:pPr>
       <w:r>
         <w:rPr>
           <w:rFonts w:ascii="Arial" w:hAnsi="Arial" w:eastAsia="Arial"/>
+          <w:b w:val="0"/>
+          <w:i w:val="0"/>
           <w:sz w:val="21"/>
         </w:rPr>
-        <w:t>Geben Sie die kurze Testäußerung ein, die Sie vorbereitet haben.</w:t>
+        <w:t>3. Geben Sie die kurze Testäußerung ein, die Sie vorbereitet haben.</w:t>
       </w:r>
     </w:p>
     <w:p>
       <w:pPr>
-        <w:pStyle w:val="ListNumber"/>
         <w:spacing w:after="80"/>
+        <w:ind w:left="360" w:hanging="288"/>
       </w:pPr>
       <w:r>
         <w:rPr>
           <w:rFonts w:ascii="Arial" w:hAnsi="Arial" w:eastAsia="Arial"/>
+          <w:b w:val="0"/>
+          <w:i w:val="0"/>
           <w:sz w:val="21"/>
         </w:rPr>
-        <w:t>Führen Sie den Test aus.</w:t>
+        <w:t>4. Führen Sie den Test aus.</w:t>
       </w:r>
     </w:p>
     <w:p>
@@ -1775,67 +2283,77 @@
     </w:p>
     <w:p>
       <w:pPr>
-        <w:pStyle w:val="ListNumber"/>
         <w:spacing w:after="80"/>
+        <w:ind w:left="360" w:hanging="288"/>
       </w:pPr>
       <w:r>
         <w:rPr>
           <w:rFonts w:ascii="Arial" w:hAnsi="Arial" w:eastAsia="Arial"/>
+          <w:b w:val="0"/>
+          <w:i w:val="0"/>
           <w:sz w:val="21"/>
         </w:rPr>
-        <w:t>Überprüft, ob der aktuell ausgewählte Bot und die aktuell ausgewählte Version zum Testen berechtigt sind.</w:t>
+        <w:t>1. Überprüft, ob der aktuell ausgewählte Bot und die aktuell ausgewählte Version zum Testen berechtigt sind.</w:t>
       </w:r>
     </w:p>
     <w:p>
       <w:pPr>
-        <w:pStyle w:val="ListNumber"/>
         <w:spacing w:after="80"/>
+        <w:ind w:left="360" w:hanging="288"/>
       </w:pPr>
       <w:r>
         <w:rPr>
           <w:rFonts w:ascii="Arial" w:hAnsi="Arial" w:eastAsia="Arial"/>
+          <w:b w:val="0"/>
+          <w:i w:val="0"/>
           <w:sz w:val="21"/>
         </w:rPr>
-        <w:t>Überprüfen Sie den Kombinationsstatus von NLU-Methode, Modell und Antwortmethode.</w:t>
+        <w:t>2. Überprüfen Sie den Kombinationsstatus von NLU-Methode, Modell und Antwortmethode.</w:t>
       </w:r>
     </w:p>
     <w:p>
       <w:pPr>
-        <w:pStyle w:val="ListNumber"/>
         <w:spacing w:after="80"/>
+        <w:ind w:left="360" w:hanging="288"/>
       </w:pPr>
       <w:r>
         <w:rPr>
           <w:rFonts w:ascii="Arial" w:hAnsi="Arial" w:eastAsia="Arial"/>
+          <w:b w:val="0"/>
+          <w:i w:val="0"/>
           <w:sz w:val="21"/>
         </w:rPr>
-        <w:t>Überprüfen Sie den Schulungs- oder Indexbereitschaftsstatus und Fehlermeldungen.</w:t>
+        <w:t>3. Überprüfen Sie den Schulungs- oder Indexbereitschaftsstatus und Fehlermeldungen.</w:t>
       </w:r>
     </w:p>
     <w:p>
       <w:pPr>
-        <w:pStyle w:val="ListNumber"/>
         <w:spacing w:after="80"/>
+        <w:ind w:left="360" w:hanging="288"/>
       </w:pPr>
       <w:r>
         <w:rPr>
           <w:rFonts w:ascii="Arial" w:hAnsi="Arial" w:eastAsia="Arial"/>
+          <w:b w:val="0"/>
+          <w:i w:val="0"/>
           <w:sz w:val="21"/>
         </w:rPr>
-        <w:t>Geben Sie die repräsentative Äußerung bzw. andere Variantenäußerungen erneut ein.</w:t>
+        <w:t>4. Geben Sie die repräsentative Äußerung bzw. andere Variantenäußerungen erneut ein.</w:t>
       </w:r>
     </w:p>
     <w:p>
       <w:pPr>
-        <w:pStyle w:val="ListNumber"/>
         <w:spacing w:after="80"/>
+        <w:ind w:left="360" w:hanging="288"/>
       </w:pPr>
       <w:r>
         <w:rPr>
           <w:rFonts w:ascii="Arial" w:hAnsi="Arial" w:eastAsia="Arial"/>
+          <w:b w:val="0"/>
+          <w:i w:val="0"/>
           <w:sz w:val="21"/>
         </w:rPr>
-        <w:t>Wenn der Fehler weiterhin besteht, werden Bot, Version, Engine, Auslösung und Fehlerzeit aufgezeichnet und an den Betriebsleiter übermittelt.</w:t>
+        <w:t>5. Wenn der Fehler weiterhin besteht, werden Bot, Version, Engine, Auslösung und Fehlerzeit aufgezeichnet und an den Betriebsleiter übermittelt.</w:t>
       </w:r>
     </w:p>
     <w:p>
@@ -1871,6 +2389,8 @@
       <w:r>
         <w:rPr>
           <w:rFonts w:ascii="Arial" w:hAnsi="Arial" w:eastAsia="Arial"/>
+          <w:b w:val="0"/>
+          <w:i w:val="0"/>
           <w:sz w:val="21"/>
         </w:rPr>
         <w:t>Simulator: Eingabeäußerung und sofortige Reaktion</w:t>
@@ -1884,6 +2404,8 @@
       <w:r>
         <w:rPr>
           <w:rFonts w:ascii="Arial" w:hAnsi="Arial" w:eastAsia="Arial"/>
+          <w:b w:val="0"/>
+          <w:i w:val="0"/>
           <w:sz w:val="21"/>
         </w:rPr>
         <w:t>Analyse: Kumulative Klassifizierungsergebnisse und Anwendungsschritte</w:t>
@@ -1897,6 +2419,8 @@
       <w:r>
         <w:rPr>
           <w:rFonts w:ascii="Arial" w:hAnsi="Arial" w:eastAsia="Arial"/>
+          <w:b w:val="0"/>
+          <w:i w:val="0"/>
           <w:sz w:val="21"/>
         </w:rPr>
         <w:t>Auswertung: Auswertungsdaten und Ergebnisse</w:t>
@@ -1910,6 +2434,8 @@
       <w:r>
         <w:rPr>
           <w:rFonts w:ascii="Arial" w:hAnsi="Arial" w:eastAsia="Arial"/>
+          <w:b w:val="0"/>
+          <w:i w:val="0"/>
           <w:sz w:val="21"/>
         </w:rPr>
         <w:t>Gesprächsverlauf: Gespeicherter Gesprächsverlauf</w:t>
@@ -1937,6 +2463,354 @@
           <w:i w:val="0"/>
           <w:sz w:val="21"/>
         </w:rPr>
+        <w:t>Bildschirmgeführtes Getting Started verwenden</w:t>
+      </w:r>
+    </w:p>
+    <w:p>
+      <w:r>
+        <w:rPr>
+          <w:rFonts w:ascii="Arial" w:hAnsi="Arial" w:eastAsia="Arial"/>
+          <w:b w:val="0"/>
+          <w:i w:val="0"/>
+          <w:sz w:val="21"/>
+        </w:rPr>
+        <w:t xml:space="preserve">Unten links </w:t>
+      </w:r>
+      <w:r>
+        <w:rPr>
+          <w:rFonts w:ascii="Arial" w:hAnsi="Arial" w:eastAsia="Arial"/>
+          <w:b/>
+          <w:i w:val="0"/>
+          <w:sz w:val="21"/>
+        </w:rPr>
+        <w:t>?</w:t>
+      </w:r>
+      <w:r>
+        <w:rPr>
+          <w:rFonts w:ascii="Arial" w:hAnsi="Arial" w:eastAsia="Arial"/>
+          <w:b w:val="0"/>
+          <w:i w:val="0"/>
+          <w:sz w:val="21"/>
+        </w:rPr>
+        <w:t xml:space="preserve"> öffnen und </w:t>
+      </w:r>
+      <w:r>
+        <w:rPr>
+          <w:rFonts w:ascii="Arial" w:hAnsi="Arial" w:eastAsia="Arial"/>
+          <w:b/>
+          <w:i w:val="0"/>
+          <w:sz w:val="21"/>
+        </w:rPr>
+        <w:t>Erste Schritte</w:t>
+      </w:r>
+      <w:r>
+        <w:rPr>
+          <w:rFonts w:ascii="Arial" w:hAnsi="Arial" w:eastAsia="Arial"/>
+          <w:b w:val="0"/>
+          <w:i w:val="0"/>
+          <w:sz w:val="21"/>
+        </w:rPr>
+        <w:t xml:space="preserve"> wählen. Die Anleitung liegt über dem aktuellen CGA-Bildschirm und kann jederzeit geschlossen werden.</w:t>
+      </w:r>
+    </w:p>
+    <w:tbl>
+      <w:tblPr>
+        <w:tblStyle w:val="TableGrid"/>
+        <w:tblW w:type="dxa" w:w="9360"/>
+        <w:jc w:val="left"/>
+        <w:tblLayout w:type="fixed"/>
+        <w:tblLook w:firstColumn="1" w:firstRow="1" w:lastColumn="0" w:lastRow="0" w:noHBand="0" w:noVBand="1" w:val="04A0"/>
+      </w:tblPr>
+      <w:tblGrid>
+        <w:gridCol w:w="4680"/>
+        <w:gridCol w:w="4680"/>
+      </w:tblGrid>
+      <w:tr>
+        <w:tc>
+          <w:tcPr>
+            <w:tcW w:type="dxa" w:w="4680"/>
+            <w:vAlign w:val="center"/>
+            <w:tcMar>
+              <w:top w:w="80" w:type="dxa"/>
+              <w:start w:w="120" w:type="dxa"/>
+              <w:bottom w:w="80" w:type="dxa"/>
+              <w:end w:w="120" w:type="dxa"/>
+            </w:tcMar>
+            <w:shd w:fill="E8EEF5"/>
+          </w:tcPr>
+          <w:p>
+            <w:pPr>
+              <w:spacing w:after="40"/>
+            </w:pPr>
+            <w:r/>
+            <w:r>
+              <w:rPr>
+                <w:rFonts w:ascii="Arial" w:hAnsi="Arial" w:eastAsia="Arial"/>
+                <w:b/>
+                <w:i w:val="0"/>
+                <w:color w:val="1F4D78"/>
+                <w:sz w:val="18"/>
+              </w:rPr>
+              <w:t>Tour</w:t>
+            </w:r>
+          </w:p>
+        </w:tc>
+        <w:tc>
+          <w:tcPr>
+            <w:tcW w:type="dxa" w:w="4680"/>
+            <w:vAlign w:val="center"/>
+            <w:tcMar>
+              <w:top w:w="80" w:type="dxa"/>
+              <w:start w:w="120" w:type="dxa"/>
+              <w:bottom w:w="80" w:type="dxa"/>
+              <w:end w:w="120" w:type="dxa"/>
+            </w:tcMar>
+            <w:shd w:fill="E8EEF5"/>
+          </w:tcPr>
+          <w:p>
+            <w:pPr>
+              <w:spacing w:after="40"/>
+            </w:pPr>
+            <w:r/>
+            <w:r>
+              <w:rPr>
+                <w:rFonts w:ascii="Arial" w:hAnsi="Arial" w:eastAsia="Arial"/>
+                <w:b/>
+                <w:i w:val="0"/>
+                <w:color w:val="1F4D78"/>
+                <w:sz w:val="18"/>
+              </w:rPr>
+              <w:t>Acht Schritte</w:t>
+            </w:r>
+          </w:p>
+        </w:tc>
+      </w:tr>
+      <w:tr>
+        <w:tc>
+          <w:tcPr>
+            <w:tcW w:type="dxa" w:w="4680"/>
+            <w:vAlign w:val="center"/>
+            <w:tcMar>
+              <w:top w:w="80" w:type="dxa"/>
+              <w:start w:w="120" w:type="dxa"/>
+              <w:bottom w:w="80" w:type="dxa"/>
+              <w:end w:w="120" w:type="dxa"/>
+            </w:tcMar>
+          </w:tcPr>
+          <w:p>
+            <w:pPr>
+              <w:spacing w:after="40"/>
+            </w:pPr>
+            <w:r/>
+            <w:r>
+              <w:rPr>
+                <w:rFonts w:ascii="Arial" w:hAnsi="Arial" w:eastAsia="Arial"/>
+                <w:b w:val="0"/>
+                <w:i w:val="0"/>
+                <w:sz w:val="18"/>
+              </w:rPr>
+              <w:t>Hauptmenüs erkunden</w:t>
+            </w:r>
+          </w:p>
+        </w:tc>
+        <w:tc>
+          <w:tcPr>
+            <w:tcW w:type="dxa" w:w="4680"/>
+            <w:vAlign w:val="center"/>
+            <w:tcMar>
+              <w:top w:w="80" w:type="dxa"/>
+              <w:start w:w="120" w:type="dxa"/>
+              <w:bottom w:w="80" w:type="dxa"/>
+              <w:end w:w="120" w:type="dxa"/>
+            </w:tcMar>
+          </w:tcPr>
+          <w:p>
+            <w:pPr>
+              <w:spacing w:after="40"/>
+            </w:pPr>
+            <w:r/>
+            <w:r>
+              <w:rPr>
+                <w:rFonts w:ascii="Arial" w:hAnsi="Arial" w:eastAsia="Arial"/>
+                <w:b w:val="0"/>
+                <w:i w:val="0"/>
+                <w:sz w:val="18"/>
+              </w:rPr>
+              <w:t>Bot → API → Admin → Intents und Trainingssätze → Entitäten und Wörterbücher → Bewertung → Nachtraining → Analyse</w:t>
+            </w:r>
+          </w:p>
+        </w:tc>
+      </w:tr>
+      <w:tr>
+        <w:tc>
+          <w:tcPr>
+            <w:tcW w:type="dxa" w:w="4680"/>
+            <w:vAlign w:val="center"/>
+            <w:tcMar>
+              <w:top w:w="80" w:type="dxa"/>
+              <w:start w:w="120" w:type="dxa"/>
+              <w:bottom w:w="80" w:type="dxa"/>
+              <w:end w:w="120" w:type="dxa"/>
+            </w:tcMar>
+          </w:tcPr>
+          <w:p>
+            <w:pPr>
+              <w:spacing w:after="40"/>
+            </w:pPr>
+            <w:r/>
+            <w:r>
+              <w:rPr>
+                <w:rFonts w:ascii="Arial" w:hAnsi="Arial" w:eastAsia="Arial"/>
+                <w:b w:val="0"/>
+                <w:i w:val="0"/>
+                <w:sz w:val="18"/>
+              </w:rPr>
+              <w:t>Bot erstellen</w:t>
+            </w:r>
+          </w:p>
+        </w:tc>
+        <w:tc>
+          <w:tcPr>
+            <w:tcW w:type="dxa" w:w="4680"/>
+            <w:vAlign w:val="center"/>
+            <w:tcMar>
+              <w:top w:w="80" w:type="dxa"/>
+              <w:start w:w="120" w:type="dxa"/>
+              <w:bottom w:w="80" w:type="dxa"/>
+              <w:end w:w="120" w:type="dxa"/>
+            </w:tcMar>
+          </w:tcPr>
+          <w:p>
+            <w:pPr>
+              <w:spacing w:after="40"/>
+            </w:pPr>
+            <w:r/>
+            <w:r>
+              <w:rPr>
+                <w:rFonts w:ascii="Arial" w:hAnsi="Arial" w:eastAsia="Arial"/>
+                <w:b w:val="0"/>
+                <w:i w:val="0"/>
+                <w:sz w:val="18"/>
+              </w:rPr>
+              <w:t>Erstellung → Intent-Engine → Modell und Antwortart → Intents und Sätze → Entitäten, Wörterbücher und Flows → Training → Bot Test → Verbesserung</w:t>
+            </w:r>
+          </w:p>
+        </w:tc>
+      </w:tr>
+    </w:tbl>
+    <w:p/>
+    <w:p>
+      <w:r>
+        <w:rPr>
+          <w:rFonts w:ascii="Arial" w:hAnsi="Arial" w:eastAsia="Arial"/>
+          <w:b w:val="0"/>
+          <w:i w:val="0"/>
+          <w:sz w:val="21"/>
+        </w:rPr>
+        <w:t xml:space="preserve">Tour wählen und </w:t>
+      </w:r>
+      <w:r>
+        <w:rPr>
+          <w:rFonts w:ascii="Arial" w:hAnsi="Arial" w:eastAsia="Arial"/>
+          <w:b/>
+          <w:i w:val="0"/>
+          <w:sz w:val="21"/>
+        </w:rPr>
+        <w:t>Starten</w:t>
+      </w:r>
+      <w:r>
+        <w:rPr>
+          <w:rFonts w:ascii="Arial" w:hAnsi="Arial" w:eastAsia="Arial"/>
+          <w:b w:val="0"/>
+          <w:i w:val="0"/>
+          <w:sz w:val="21"/>
+        </w:rPr>
+        <w:t xml:space="preserve"> drücken. Mit </w:t>
+      </w:r>
+      <w:r>
+        <w:rPr>
+          <w:rFonts w:ascii="Arial" w:hAnsi="Arial" w:eastAsia="Arial"/>
+          <w:b/>
+          <w:i w:val="0"/>
+          <w:sz w:val="21"/>
+        </w:rPr>
+        <w:t>Zurück</w:t>
+      </w:r>
+      <w:r>
+        <w:rPr>
+          <w:rFonts w:ascii="Arial" w:hAnsi="Arial" w:eastAsia="Arial"/>
+          <w:b w:val="0"/>
+          <w:i w:val="0"/>
+          <w:sz w:val="21"/>
+        </w:rPr>
+        <w:t xml:space="preserve">, </w:t>
+      </w:r>
+      <w:r>
+        <w:rPr>
+          <w:rFonts w:ascii="Arial" w:hAnsi="Arial" w:eastAsia="Arial"/>
+          <w:b/>
+          <w:i w:val="0"/>
+          <w:sz w:val="21"/>
+        </w:rPr>
+        <w:t>Weiter</w:t>
+      </w:r>
+      <w:r>
+        <w:rPr>
+          <w:rFonts w:ascii="Arial" w:hAnsi="Arial" w:eastAsia="Arial"/>
+          <w:b w:val="0"/>
+          <w:i w:val="0"/>
+          <w:sz w:val="21"/>
+        </w:rPr>
+        <w:t xml:space="preserve"> oder einer Schrittnummer navigieren. </w:t>
+      </w:r>
+      <w:r>
+        <w:rPr>
+          <w:rFonts w:ascii="Arial" w:hAnsi="Arial" w:eastAsia="Arial"/>
+          <w:b/>
+          <w:i w:val="0"/>
+          <w:sz w:val="21"/>
+        </w:rPr>
+        <w:t>Andere Tour anzeigen</w:t>
+      </w:r>
+      <w:r>
+        <w:rPr>
+          <w:rFonts w:ascii="Arial" w:hAnsi="Arial" w:eastAsia="Arial"/>
+          <w:b w:val="0"/>
+          <w:i w:val="0"/>
+          <w:sz w:val="21"/>
+        </w:rPr>
+        <w:t xml:space="preserve"> wechselt den Kurs. Im letzten Schritt öffnet </w:t>
+      </w:r>
+      <w:r>
+        <w:rPr>
+          <w:rFonts w:ascii="Arial" w:hAnsi="Arial" w:eastAsia="Arial"/>
+          <w:b/>
+          <w:i w:val="0"/>
+          <w:sz w:val="21"/>
+        </w:rPr>
+        <w:t>Tour beenden</w:t>
+      </w:r>
+      <w:r>
+        <w:rPr>
+          <w:rFonts w:ascii="Arial" w:hAnsi="Arial" w:eastAsia="Arial"/>
+          <w:b w:val="0"/>
+          <w:i w:val="0"/>
+          <w:sz w:val="21"/>
+        </w:rPr>
+        <w:t xml:space="preserve"> die Bot-Liste oder die Neuerstellung. Die Ausblendung beim Start gilt nur für den aktuellen Browser; über Hilfe kann die Tour erneut geöffnet werden.</w:t>
+      </w:r>
+    </w:p>
+    <w:p>
+      <w:pPr>
+        <w:pStyle w:val="Heading1"/>
+      </w:pPr>
+      <w:r>
+        <w:rPr>
+          <w:rFonts w:ascii="Arial" w:hAnsi="Arial" w:eastAsia="Arial"/>
+          <w:b/>
+          <w:i w:val="0"/>
+          <w:sz w:val="21"/>
+        </w:rPr>
         <w:t>Nächstes Dokument</w:t>
       </w:r>
     </w:p>
@@ -1948,9 +2822,11 @@
       <w:r>
         <w:rPr>
           <w:rFonts w:ascii="Arial" w:hAnsi="Arial" w:eastAsia="Arial"/>
+          <w:b w:val="0"/>
+          <w:i w:val="0"/>
           <w:sz w:val="21"/>
         </w:rPr>
-        <w:t>[Alle CGA-Handbücher anzeigen](../README.md)</w:t>
+        <w:t>Alle CGA-Handbücher anzeigen</w:t>
       </w:r>
     </w:p>
     <w:p>
@@ -1961,9 +2837,11 @@
       <w:r>
         <w:rPr>
           <w:rFonts w:ascii="Arial" w:hAnsi="Arial" w:eastAsia="Arial"/>
+          <w:b w:val="0"/>
+          <w:i w:val="0"/>
           <w:sz w:val="21"/>
         </w:rPr>
-        <w:t>[CGA-Benutzerhandbuch](../cga-user-manual/README.md)</w:t>
+        <w:t>CGA-Benutzerhandbuch</w:t>
       </w:r>
     </w:p>
     <w:p>
@@ -1974,9 +2852,11 @@
       <w:r>
         <w:rPr>
           <w:rFonts w:ascii="Arial" w:hAnsi="Arial" w:eastAsia="Arial"/>
+          <w:b w:val="0"/>
+          <w:i w:val="0"/>
           <w:sz w:val="21"/>
         </w:rPr>
-        <w:t>[CGA NLU-Nutzungsleitfaden](../cga-nlu-guide/README.md)</w:t>
+        <w:t>CGA NLU-Nutzungsleitfaden</w:t>
       </w:r>
     </w:p>
     <w:sectPr>

</xml_diff>